<commit_message>
e2 doc submission file
</commit_message>
<xml_diff>
--- a/E2/Gohlwar-Goohs-Norman-E2.docx
+++ b/E2/Gohlwar-Goohs-Norman-E2.docx
@@ -1,6 +1,6 @@
 
 <file path=word/document.xml><?xml version="1.0" encoding="utf-8"?>
-<w:document xmlns:wpc="http://schemas.microsoft.com/office/word/2010/wordprocessingCanvas" xmlns:cx="http://schemas.microsoft.com/office/drawing/2014/chartex" xmlns:cx1="http://schemas.microsoft.com/office/drawing/2015/9/8/chartex" xmlns:cx2="http://schemas.microsoft.com/office/drawing/2015/10/21/chartex" xmlns:cx3="http://schemas.microsoft.com/office/drawing/2016/5/9/chartex" xmlns:cx4="http://schemas.microsoft.com/office/drawing/2016/5/10/chartex" xmlns:cx5="http://schemas.microsoft.com/office/drawing/2016/5/11/chartex" xmlns:cx6="http://schemas.microsoft.com/office/drawing/2016/5/12/chartex" xmlns:cx7="http://schemas.microsoft.com/office/drawing/2016/5/13/chartex" xmlns:cx8="http://schemas.microsoft.com/office/drawing/2016/5/14/chartex" xmlns:mc="http://schemas.openxmlformats.org/markup-compatibility/2006" xmlns:aink="http://schemas.microsoft.com/office/drawing/2016/ink" xmlns:am3d="http://schemas.microsoft.com/office/drawing/2017/model3d" xmlns:o="urn:schemas-microsoft-com:office:office" xmlns:oel="http://schemas.microsoft.com/office/2019/extlst" xmlns:r="http://schemas.openxmlformats.org/officeDocument/2006/relationships" xmlns:m="http://schemas.openxmlformats.org/officeDocument/2006/math" xmlns:v="urn:schemas-microsoft-com:vml" xmlns:wp14="http://schemas.microsoft.com/office/word/2010/wordprocessingDrawing" xmlns:wp="http://schemas.openxmlformats.org/drawingml/2006/wordprocessingDrawing" xmlns:w10="urn:schemas-microsoft-com:office:word" xmlns:w="http://schemas.openxmlformats.org/wordprocessingml/2006/main" xmlns:w14="http://schemas.microsoft.com/office/word/2010/wordml" xmlns:w15="http://schemas.microsoft.com/office/word/2012/wordml" xmlns:w16cex="http://schemas.microsoft.com/office/word/2018/wordml/cex" xmlns:w16cid="http://schemas.microsoft.com/office/word/2016/wordml/cid" xmlns:w16="http://schemas.microsoft.com/office/word/2018/wordml" xmlns:w16du="http://schemas.microsoft.com/office/word/2023/wordml/word16du" xmlns:w16sdtdh="http://schemas.microsoft.com/office/word/2020/wordml/sdtdatahash" xmlns:w16sdtfl="http://schemas.microsoft.com/office/word/2024/wordml/sdtformatlock" xmlns:w16se="http://schemas.microsoft.com/office/word/2015/wordml/symex" xmlns:wpg="http://schemas.microsoft.com/office/word/2010/wordprocessingGroup" xmlns:wpi="http://schemas.microsoft.com/office/word/2010/wordprocessingInk" xmlns:wne="http://schemas.microsoft.com/office/word/2006/wordml" xmlns:wps="http://schemas.microsoft.com/office/word/2010/wordprocessingShape" mc:Ignorable="w14 w15 w16se w16cid w16 w16cex w16sdtdh w16sdtfl w16du wp14">
+<w:document xmlns:wpc="http://schemas.microsoft.com/office/word/2010/wordprocessingCanvas" xmlns:cx="http://schemas.microsoft.com/office/drawing/2014/chartex" xmlns:cx1="http://schemas.microsoft.com/office/drawing/2015/9/8/chartex" xmlns:cx2="http://schemas.microsoft.com/office/drawing/2015/10/21/chartex" xmlns:cx3="http://schemas.microsoft.com/office/drawing/2016/5/9/chartex" xmlns:cx4="http://schemas.microsoft.com/office/drawing/2016/5/10/chartex" xmlns:cx5="http://schemas.microsoft.com/office/drawing/2016/5/11/chartex" xmlns:cx6="http://schemas.microsoft.com/office/drawing/2016/5/12/chartex" xmlns:cx7="http://schemas.microsoft.com/office/drawing/2016/5/13/chartex" xmlns:cx8="http://schemas.microsoft.com/office/drawing/2016/5/14/chartex" xmlns:mc="http://schemas.openxmlformats.org/markup-compatibility/2006" xmlns:aink="http://schemas.microsoft.com/office/drawing/2016/ink" xmlns:am3d="http://schemas.microsoft.com/office/drawing/2017/model3d" xmlns:o="urn:schemas-microsoft-com:office:office" xmlns:oel="http://schemas.microsoft.com/office/2019/extlst" xmlns:r="http://schemas.openxmlformats.org/officeDocument/2006/relationships" xmlns:m="http://schemas.openxmlformats.org/officeDocument/2006/math" xmlns:v="urn:schemas-microsoft-com:vml" xmlns:wp14="http://schemas.microsoft.com/office/word/2010/wordprocessingDrawing" xmlns:wp="http://schemas.openxmlformats.org/drawingml/2006/wordprocessingDrawing" xmlns:w10="urn:schemas-microsoft-com:office:word" xmlns:w="http://schemas.openxmlformats.org/wordprocessingml/2006/main" xmlns:w14="http://schemas.microsoft.com/office/word/2010/wordml" xmlns:w15="http://schemas.microsoft.com/office/word/2012/wordml" xmlns:w16cex="http://schemas.microsoft.com/office/word/2018/wordml/cex" xmlns:w16cid="http://schemas.microsoft.com/office/word/2016/wordml/cid" xmlns:w16="http://schemas.microsoft.com/office/word/2018/wordml" xmlns:w16du="http://schemas.microsoft.com/office/word/2023/wordml/word16du" xmlns:w16sdtdh="http://schemas.microsoft.com/office/word/2020/wordml/sdtdatahash" xmlns:w16se="http://schemas.microsoft.com/office/word/2015/wordml/symex" xmlns:wpg="http://schemas.microsoft.com/office/word/2010/wordprocessingGroup" xmlns:wpi="http://schemas.microsoft.com/office/word/2010/wordprocessingInk" xmlns:wne="http://schemas.microsoft.com/office/word/2006/wordml" xmlns:wps="http://schemas.microsoft.com/office/word/2010/wordprocessingShape" mc:Ignorable="w14 w15 w16se w16cid w16 w16cex w16sdtdh w16du wp14">
   <w:body>
     <w:p>
       <w:pPr>
@@ -27,6 +27,7 @@
         </w:rPr>
         <w:t xml:space="preserve"> </w:t>
       </w:r>
+      <w:proofErr w:type="gramStart"/>
       <w:r>
         <w:rPr>
           <w:b/>
@@ -37,7 +38,14 @@
         <w:rPr>
           <w:b/>
         </w:rPr>
-        <w:t xml:space="preserve">  -- </w:t>
+        <w:t xml:space="preserve">  --</w:t>
+      </w:r>
+      <w:proofErr w:type="gramEnd"/>
+      <w:r>
+        <w:rPr>
+          <w:b/>
+        </w:rPr>
+        <w:t xml:space="preserve"> </w:t>
       </w:r>
       <w:r>
         <w:rPr>
@@ -52,336 +60,6 @@
       </w:r>
       <w:r>
         <w:t>2025</w:t>
-      </w:r>
-    </w:p>
-    <w:p>
-      <w:pPr>
-        <w:rPr>
-          <w:sz w:val="16"/>
-          <w:szCs w:val="16"/>
-        </w:rPr>
-      </w:pPr>
-    </w:p>
-    <w:p>
-      <w:pPr>
-        <w:spacing w:before="120"/>
-        <w:rPr>
-          <w:b/>
-        </w:rPr>
-      </w:pPr>
-      <w:r>
-        <w:rPr>
-          <w:b/>
-        </w:rPr>
-        <w:t>Resources</w:t>
-      </w:r>
-    </w:p>
-    <w:p>
-      <w:pPr>
-        <w:pStyle w:val="p2"/>
-        <w:spacing w:before="120"/>
-        <w:ind w:left="360"/>
-      </w:pPr>
-      <w:r>
-        <w:rPr>
-          <w:i/>
-        </w:rPr>
-        <w:t>The Art of OS online</w:t>
-      </w:r>
-      <w:r>
-        <w:t xml:space="preserve">  </w:t>
-      </w:r>
-      <w:hyperlink r:id="rId5" w:history="1">
-        <w:r>
-          <w:rPr>
-            <w:rStyle w:val="Hyperlink"/>
-          </w:rPr>
-          <w:t xml:space="preserve">Module </w:t>
-        </w:r>
-        <w:r>
-          <w:rPr>
-            <w:rStyle w:val="Hyperlink"/>
-          </w:rPr>
-          <w:t>2</w:t>
-        </w:r>
-      </w:hyperlink>
-    </w:p>
-    <w:p>
-      <w:pPr>
-        <w:pStyle w:val="p2"/>
-        <w:spacing w:before="120"/>
-        <w:ind w:left="360"/>
-      </w:pPr>
-      <w:r>
-        <w:rPr>
-          <w:i/>
-        </w:rPr>
-        <w:t>The Art of OS online</w:t>
-      </w:r>
-      <w:r>
-        <w:t xml:space="preserve">  </w:t>
-      </w:r>
-      <w:hyperlink r:id="rId6" w:history="1">
-        <w:r>
-          <w:rPr>
-            <w:rStyle w:val="Hyperlink"/>
-          </w:rPr>
-          <w:t xml:space="preserve">Module </w:t>
-        </w:r>
-        <w:r>
-          <w:rPr>
-            <w:rStyle w:val="Hyperlink"/>
-          </w:rPr>
-          <w:t>0.3</w:t>
-        </w:r>
-      </w:hyperlink>
-      <w:r>
-        <w:t xml:space="preserve"> </w:t>
-      </w:r>
-      <w:r>
-        <w:rPr>
-          <w:rFonts w:ascii="Cambria" w:hAnsi="Cambria"/>
-          <w:sz w:val="16"/>
-          <w:szCs w:val="16"/>
-        </w:rPr>
-        <w:t>(one-page map of the levels of the OS)</w:t>
-      </w:r>
-    </w:p>
-    <w:p>
-      <w:pPr>
-        <w:pStyle w:val="p2"/>
-        <w:spacing w:before="120"/>
-        <w:ind w:left="360"/>
-        <w:rPr>
-          <w:rFonts w:ascii="Cambria" w:hAnsi="Cambria"/>
-        </w:rPr>
-      </w:pPr>
-      <w:hyperlink r:id="rId7" w:history="1">
-        <w:r>
-          <w:rPr>
-            <w:rStyle w:val="Hyperlink"/>
-            <w:rFonts w:ascii="Cambria" w:hAnsi="Cambria"/>
-            <w:i/>
-          </w:rPr>
-          <w:t>Understanding the Microprocessor</w:t>
-        </w:r>
-      </w:hyperlink>
-      <w:r>
-        <w:rPr>
-          <w:rFonts w:ascii="Cambria" w:hAnsi="Cambria"/>
-          <w:i/>
-          <w:sz w:val="16"/>
-          <w:szCs w:val="16"/>
-        </w:rPr>
-        <w:t xml:space="preserve"> </w:t>
-      </w:r>
-      <w:r>
-        <w:rPr>
-          <w:rFonts w:ascii="Cambria" w:hAnsi="Cambria"/>
-          <w:sz w:val="16"/>
-          <w:szCs w:val="16"/>
-        </w:rPr>
-        <w:t>(tutorial on microprocessor architecture)</w:t>
-      </w:r>
-    </w:p>
-    <w:p>
-      <w:pPr>
-        <w:pStyle w:val="p2"/>
-        <w:spacing w:before="120"/>
-        <w:ind w:left="360"/>
-        <w:rPr>
-          <w:rFonts w:ascii="Cambria" w:hAnsi="Cambria"/>
-        </w:rPr>
-      </w:pPr>
-      <w:r>
-        <w:rPr>
-          <w:rFonts w:ascii="Cambria" w:hAnsi="Cambria"/>
-          <w:iCs/>
-        </w:rPr>
-        <w:t>R</w:t>
-      </w:r>
-      <w:r>
-        <w:rPr>
-          <w:rFonts w:ascii="Cambria" w:hAnsi="Cambria"/>
-          <w:iCs/>
-        </w:rPr>
-        <w:t>esource</w:t>
-      </w:r>
-      <w:r>
-        <w:rPr>
-          <w:rFonts w:ascii="Cambria" w:hAnsi="Cambria"/>
-          <w:iCs/>
-        </w:rPr>
-        <w:t xml:space="preserve">s/ </w:t>
-      </w:r>
-      <w:r>
-        <w:rPr>
-          <w:rFonts w:ascii="Cambria" w:hAnsi="Cambria"/>
-          <w:i/>
-        </w:rPr>
-        <w:t>pjd-on-Machines.pdf</w:t>
-      </w:r>
-      <w:r>
-        <w:rPr>
-          <w:rFonts w:ascii="Cambria" w:hAnsi="Cambria"/>
-        </w:rPr>
-        <w:t xml:space="preserve"> </w:t>
-      </w:r>
-      <w:r>
-        <w:rPr>
-          <w:rFonts w:ascii="Cambria" w:hAnsi="Cambria"/>
-          <w:sz w:val="16"/>
-          <w:szCs w:val="16"/>
-        </w:rPr>
-        <w:t>(review of the nature of computing machines controlled by the operating system)</w:t>
-      </w:r>
-    </w:p>
-    <w:p>
-      <w:pPr>
-        <w:pStyle w:val="p2"/>
-        <w:spacing w:before="120"/>
-        <w:ind w:left="360"/>
-        <w:rPr>
-          <w:sz w:val="20"/>
-          <w:szCs w:val="20"/>
-        </w:rPr>
-      </w:pPr>
-      <w:r>
-        <w:rPr>
-          <w:rFonts w:ascii="Cambria" w:hAnsi="Cambria"/>
-          <w:iCs/>
-        </w:rPr>
-        <w:t>R</w:t>
-      </w:r>
-      <w:r>
-        <w:rPr>
-          <w:rFonts w:ascii="Cambria" w:hAnsi="Cambria"/>
-          <w:iCs/>
-        </w:rPr>
-        <w:t>esource</w:t>
-      </w:r>
-      <w:r>
-        <w:rPr>
-          <w:rFonts w:ascii="Cambria" w:hAnsi="Cambria"/>
-          <w:iCs/>
-        </w:rPr>
-        <w:t xml:space="preserve">s/ </w:t>
-      </w:r>
-      <w:r>
-        <w:rPr>
-          <w:i/>
-        </w:rPr>
-        <w:t>os99.pdf</w:t>
-      </w:r>
-      <w:r>
-        <w:t xml:space="preserve">  §5.1 (p13)</w:t>
-      </w:r>
-      <w:r>
-        <w:rPr>
-          <w:sz w:val="16"/>
-          <w:szCs w:val="16"/>
-        </w:rPr>
-        <w:t xml:space="preserve"> (technical reference)</w:t>
-      </w:r>
-    </w:p>
-    <w:p>
-      <w:pPr>
-        <w:pStyle w:val="p2"/>
-        <w:spacing w:before="120"/>
-        <w:ind w:left="360"/>
-        <w:rPr>
-          <w:sz w:val="20"/>
-          <w:szCs w:val="20"/>
-        </w:rPr>
-      </w:pPr>
-      <w:r>
-        <w:rPr>
-          <w:rFonts w:ascii="Cambria" w:hAnsi="Cambria"/>
-          <w:iCs/>
-        </w:rPr>
-        <w:t>R</w:t>
-      </w:r>
-      <w:r>
-        <w:rPr>
-          <w:rFonts w:ascii="Cambria" w:hAnsi="Cambria"/>
-          <w:iCs/>
-        </w:rPr>
-        <w:t>esource</w:t>
-      </w:r>
-      <w:r>
-        <w:rPr>
-          <w:rFonts w:ascii="Cambria" w:hAnsi="Cambria"/>
-          <w:iCs/>
-        </w:rPr>
-        <w:t xml:space="preserve">s/ </w:t>
-      </w:r>
-      <w:r>
-        <w:rPr>
-          <w:i/>
-          <w:iCs/>
-        </w:rPr>
-        <w:t>stack-example.pdf</w:t>
-      </w:r>
-      <w:r>
-        <w:rPr>
-          <w:sz w:val="20"/>
-          <w:szCs w:val="20"/>
-        </w:rPr>
-        <w:t xml:space="preserve"> </w:t>
-      </w:r>
-      <w:r>
-        <w:rPr>
-          <w:sz w:val="16"/>
-          <w:szCs w:val="16"/>
-        </w:rPr>
-        <w:t>(optional reference for stack refresher)</w:t>
-      </w:r>
-    </w:p>
-    <w:p>
-      <w:pPr>
-        <w:pStyle w:val="p2"/>
-        <w:spacing w:before="120"/>
-        <w:ind w:left="360"/>
-        <w:rPr>
-          <w:rFonts w:ascii="Cambria" w:hAnsi="Cambria"/>
-          <w:sz w:val="20"/>
-          <w:szCs w:val="20"/>
-        </w:rPr>
-      </w:pPr>
-      <w:r>
-        <w:rPr>
-          <w:rFonts w:ascii="Cambria" w:hAnsi="Cambria"/>
-          <w:iCs/>
-        </w:rPr>
-        <w:t>R</w:t>
-      </w:r>
-      <w:r>
-        <w:rPr>
-          <w:rFonts w:ascii="Cambria" w:hAnsi="Cambria"/>
-          <w:iCs/>
-        </w:rPr>
-        <w:t>esource</w:t>
-      </w:r>
-      <w:r>
-        <w:rPr>
-          <w:rFonts w:ascii="Cambria" w:hAnsi="Cambria"/>
-          <w:iCs/>
-        </w:rPr>
-        <w:t xml:space="preserve">s/ </w:t>
-      </w:r>
-      <w:r>
-        <w:rPr>
-          <w:i/>
-          <w:iCs/>
-        </w:rPr>
-        <w:t>Ch 8 virtual machine II.pdf</w:t>
-      </w:r>
-      <w:r>
-        <w:rPr>
-          <w:sz w:val="16"/>
-          <w:szCs w:val="16"/>
-        </w:rPr>
-        <w:t xml:space="preserve"> (optional reference for stack refresher)</w:t>
       </w:r>
     </w:p>
     <w:p>
@@ -597,6 +275,79 @@
     <w:p>
       <w:pPr>
         <w:pStyle w:val="p2"/>
+        <w:spacing w:before="120"/>
+        <w:ind w:left="1440"/>
+      </w:pPr>
+      <w:r>
+        <w:rPr>
+          <w:highlight w:val="yellow"/>
+        </w:rPr>
+        <w:t xml:space="preserve">The OS can’t have multiple interrupt signals at a time. The OS needs to handle each </w:t>
+      </w:r>
+      <w:r>
+        <w:rPr>
+          <w:highlight w:val="yellow"/>
+        </w:rPr>
+        <w:t>exception</w:t>
+      </w:r>
+      <w:r>
+        <w:rPr>
+          <w:highlight w:val="yellow"/>
+        </w:rPr>
+        <w:t xml:space="preserve"> separately.</w:t>
+      </w:r>
+      <w:r>
+        <w:rPr>
+          <w:highlight w:val="yellow"/>
+        </w:rPr>
+        <w:t xml:space="preserve"> </w:t>
+      </w:r>
+      <w:r>
+        <w:rPr>
+          <w:highlight w:val="yellow"/>
+        </w:rPr>
+        <w:t>The selector circuit prioritizes signals, choosing the highest priority one or deferring others.</w:t>
+      </w:r>
+      <w:r>
+        <w:rPr>
+          <w:highlight w:val="yellow"/>
+        </w:rPr>
+        <w:t xml:space="preserve"> If multiple interrupts were allowed to occur and interrupt the dispatcher, there could be multiple issues like race conditions for interrupt handling</w:t>
+      </w:r>
+      <w:r>
+        <w:rPr>
+          <w:highlight w:val="yellow"/>
+        </w:rPr>
+        <w:t xml:space="preserve"> or</w:t>
+      </w:r>
+      <w:r>
+        <w:rPr>
+          <w:highlight w:val="yellow"/>
+        </w:rPr>
+        <w:t xml:space="preserve"> </w:t>
+      </w:r>
+      <w:r>
+        <w:rPr>
+          <w:highlight w:val="yellow"/>
+        </w:rPr>
+        <w:t xml:space="preserve">inconsistent/corrupted state </w:t>
+      </w:r>
+      <w:r>
+        <w:rPr>
+          <w:highlight w:val="yellow"/>
+        </w:rPr>
+        <w:t>of the dispatcher</w:t>
+      </w:r>
+      <w:r>
+        <w:rPr>
+          <w:highlight w:val="yellow"/>
+        </w:rPr>
+        <w:t>.</w:t>
+      </w:r>
+    </w:p>
+    <w:p>
+      <w:pPr>
+        <w:pStyle w:val="p2"/>
         <w:numPr>
           <w:ilvl w:val="1"/>
           <w:numId w:val="16"/>
@@ -611,6 +362,91 @@
       </w:r>
       <w:r>
         <w:t>restricted to kernel mode?</w:t>
+      </w:r>
+    </w:p>
+    <w:p>
+      <w:pPr>
+        <w:pStyle w:val="p2"/>
+        <w:spacing w:before="120"/>
+        <w:ind w:left="1440"/>
+      </w:pPr>
+      <w:r>
+        <w:rPr>
+          <w:highlight w:val="yellow"/>
+        </w:rPr>
+        <w:t>Instructions that change the state of the system</w:t>
+      </w:r>
+      <w:r>
+        <w:rPr>
+          <w:highlight w:val="yellow"/>
+        </w:rPr>
+        <w:t xml:space="preserve"> </w:t>
+      </w:r>
+      <w:r>
+        <w:rPr>
+          <w:highlight w:val="yellow"/>
+        </w:rPr>
+        <w:t xml:space="preserve">and affect other executing programs are considered sensitive </w:t>
+      </w:r>
+      <w:r>
+        <w:rPr>
+          <w:highlight w:val="yellow"/>
+        </w:rPr>
+        <w:t>and classified as privileged, therefore instructions</w:t>
+      </w:r>
+      <w:r>
+        <w:rPr>
+          <w:highlight w:val="yellow"/>
+        </w:rPr>
+        <w:t xml:space="preserve"> </w:t>
+      </w:r>
+      <w:r>
+        <w:rPr>
+          <w:highlight w:val="yellow"/>
+        </w:rPr>
+        <w:t>to turn off or on interrupts are restricted</w:t>
+      </w:r>
+      <w:r>
+        <w:rPr>
+          <w:highlight w:val="yellow"/>
+        </w:rPr>
+        <w:t xml:space="preserve"> </w:t>
+      </w:r>
+      <w:r>
+        <w:rPr>
+          <w:highlight w:val="yellow"/>
+        </w:rPr>
+        <w:t xml:space="preserve">to the kernel-state. </w:t>
+      </w:r>
+      <w:r>
+        <w:rPr>
+          <w:highlight w:val="yellow"/>
+        </w:rPr>
+        <w:t xml:space="preserve">Beyond this, instructions that turn interrupts off create a vulnerability by design such that there is no ability to see another </w:t>
+      </w:r>
+      <w:r>
+        <w:rPr>
+          <w:highlight w:val="yellow"/>
+        </w:rPr>
+        <w:t>interrupt</w:t>
+      </w:r>
+      <w:r>
+        <w:rPr>
+          <w:highlight w:val="yellow"/>
+        </w:rPr>
+        <w:t xml:space="preserve">– and inherently preventing the CPU from being able to respond to vital signals like </w:t>
+      </w:r>
+      <w:r>
+        <w:rPr>
+          <w:highlight w:val="yellow"/>
+        </w:rPr>
+        <w:t>a page fault</w:t>
+      </w:r>
+      <w:r>
+        <w:rPr>
+          <w:highlight w:val="yellow"/>
+        </w:rPr>
+        <w:t>, which in turn could lead to system slowdowns and instability.</w:t>
       </w:r>
     </w:p>
     <w:p>
@@ -651,14 +487,35 @@
     <w:p>
       <w:pPr>
         <w:pStyle w:val="p2"/>
-        <w:numPr>
-          <w:ilvl w:val="1"/>
-          <w:numId w:val="16"/>
-        </w:numPr>
         <w:spacing w:before="120"/>
-      </w:pPr>
-      <w:r>
-        <w:t>Where in the interrupt hardware are the priorities implemented?</w:t>
+        <w:ind w:left="1440"/>
+      </w:pPr>
+      <w:r>
+        <w:rPr>
+          <w:highlight w:val="yellow"/>
+        </w:rPr>
+        <w:t xml:space="preserve">Broadly speaking, the priorities of interrupts are "design decisions set by negotiation between software and hardware engineers." The </w:t>
+      </w:r>
+      <w:r>
+        <w:rPr>
+          <w:highlight w:val="yellow"/>
+        </w:rPr>
+        <w:lastRenderedPageBreak/>
+        <w:t xml:space="preserve">selector handles priorities of signals based on the condition's numbers 0, 1, 2, ..., S-1 with priorities assigned according to the system design (note: priority ordering varies by system architecture). Generally, hardware-detected interrupts for critical events take priority over software-initiated requests. Hardware events include "divide by zero", "overflow", page faults, </w:t>
+      </w:r>
+      <w:proofErr w:type="spellStart"/>
+      <w:r>
+        <w:rPr>
+          <w:highlight w:val="yellow"/>
+        </w:rPr>
+        <w:t>etc</w:t>
+      </w:r>
+      <w:proofErr w:type="spellEnd"/>
+      <w:r>
+        <w:rPr>
+          <w:highlight w:val="yellow"/>
+        </w:rPr>
+        <w:t xml:space="preserve"> which are detected by the ALU/MMU and require immediate handling. Lower priority interrupts include software requests like microkernel system calls (KC) which can be deferred.</w:t>
       </w:r>
     </w:p>
     <w:p>
@@ -671,6 +528,92 @@
         <w:spacing w:before="120"/>
       </w:pPr>
       <w:r>
+        <w:t>Where in the interrupt hardware are the priorities implemented?</w:t>
+      </w:r>
+    </w:p>
+    <w:p>
+      <w:pPr>
+        <w:pStyle w:val="p2"/>
+        <w:spacing w:before="120"/>
+        <w:ind w:left="1440"/>
+      </w:pPr>
+      <w:r>
+        <w:rPr>
+          <w:highlight w:val="yellow"/>
+        </w:rPr>
+        <w:t>The selector</w:t>
+      </w:r>
+      <w:r>
+        <w:rPr>
+          <w:highlight w:val="yellow"/>
+        </w:rPr>
+        <w:t xml:space="preserve"> </w:t>
+      </w:r>
+      <w:r>
+        <w:rPr>
+          <w:highlight w:val="yellow"/>
+        </w:rPr>
+        <w:t>circuit</w:t>
+      </w:r>
+      <w:r>
+        <w:rPr>
+          <w:highlight w:val="yellow"/>
+        </w:rPr>
+        <w:t xml:space="preserve"> (in the CPU)</w:t>
+      </w:r>
+      <w:r>
+        <w:rPr>
+          <w:highlight w:val="yellow"/>
+        </w:rPr>
+        <w:t>, which is responsible for receiving signals from all sensors and selecting the signal of the highest priority.</w:t>
+      </w:r>
+      <w:r>
+        <w:rPr>
+          <w:highlight w:val="yellow"/>
+        </w:rPr>
+        <w:t xml:space="preserve"> The Pr</w:t>
+      </w:r>
+      <w:r>
+        <w:rPr>
+          <w:highlight w:val="yellow"/>
+        </w:rPr>
+        <w:t>ogram</w:t>
+      </w:r>
+      <w:r>
+        <w:rPr>
+          <w:highlight w:val="yellow"/>
+        </w:rPr>
+        <w:t xml:space="preserve"> </w:t>
+      </w:r>
+      <w:r>
+        <w:rPr>
+          <w:highlight w:val="yellow"/>
+        </w:rPr>
+        <w:t>Status Word (</w:t>
+      </w:r>
+      <w:r>
+        <w:rPr>
+          <w:highlight w:val="yellow"/>
+        </w:rPr>
+        <w:t xml:space="preserve">also in the CPU) </w:t>
+      </w:r>
+      <w:r>
+        <w:rPr>
+          <w:highlight w:val="yellow"/>
+        </w:rPr>
+        <w:t>provides a mask functionality which can hide the lower priority sensor signals until the higher priority signal is handled.</w:t>
+      </w:r>
+    </w:p>
+    <w:p>
+      <w:pPr>
+        <w:pStyle w:val="p2"/>
+        <w:numPr>
+          <w:ilvl w:val="1"/>
+          <w:numId w:val="16"/>
+        </w:numPr>
+        <w:spacing w:before="120"/>
+      </w:pPr>
+      <w:r>
         <w:t xml:space="preserve">What </w:t>
       </w:r>
       <w:r>
@@ -687,6 +630,106 @@
       </w:r>
       <w:r>
         <w:t xml:space="preserve"> in the same instruction cycle?</w:t>
+      </w:r>
+    </w:p>
+    <w:p>
+      <w:pPr>
+        <w:pStyle w:val="p2"/>
+        <w:spacing w:before="120"/>
+        <w:ind w:left="1440"/>
+      </w:pPr>
+      <w:r>
+        <w:rPr>
+          <w:highlight w:val="yellow"/>
+        </w:rPr>
+        <w:t>Multiple interrupts which arrive at the same time are handled based on the priorities of the sensors associated with the interrupt signals</w:t>
+      </w:r>
+      <w:r>
+        <w:rPr>
+          <w:highlight w:val="yellow"/>
+        </w:rPr>
+        <w:t>,</w:t>
+      </w:r>
+      <w:r>
+        <w:rPr>
+          <w:highlight w:val="yellow"/>
+        </w:rPr>
+        <w:t xml:space="preserve"> </w:t>
+      </w:r>
+      <w:r>
+        <w:rPr>
+          <w:highlight w:val="yellow"/>
+        </w:rPr>
+        <w:t>effectively creating a queu</w:t>
+      </w:r>
+      <w:r>
+        <w:rPr>
+          <w:highlight w:val="yellow"/>
+        </w:rPr>
+        <w:t>e</w:t>
+      </w:r>
+      <w:r>
+        <w:rPr>
+          <w:highlight w:val="yellow"/>
+        </w:rPr>
+        <w:t>.</w:t>
+      </w:r>
+      <w:r>
+        <w:rPr>
+          <w:highlight w:val="yellow"/>
+        </w:rPr>
+        <w:t xml:space="preserve"> </w:t>
+      </w:r>
+      <w:r>
+        <w:rPr>
+          <w:highlight w:val="yellow"/>
+        </w:rPr>
+        <w:t xml:space="preserve">The selector </w:t>
+      </w:r>
+      <w:r>
+        <w:rPr>
+          <w:highlight w:val="yellow"/>
+        </w:rPr>
+        <w:t xml:space="preserve">has </w:t>
+      </w:r>
+      <w:r>
+        <w:rPr>
+          <w:highlight w:val="yellow"/>
+        </w:rPr>
+        <w:t xml:space="preserve">0 to </w:t>
+      </w:r>
+      <w:r>
+        <w:rPr>
+          <w:highlight w:val="yellow"/>
+        </w:rPr>
+        <w:t>S-</w:t>
+      </w:r>
+      <w:r>
+        <w:rPr>
+          <w:highlight w:val="yellow"/>
+        </w:rPr>
+        <w:t>1</w:t>
+      </w:r>
+      <w:r>
+        <w:rPr>
+          <w:highlight w:val="yellow"/>
+        </w:rPr>
+        <w:t xml:space="preserve"> input</w:t>
+      </w:r>
+      <w:r>
+        <w:rPr>
+          <w:highlight w:val="yellow"/>
+        </w:rPr>
+        <w:t xml:space="preserve">s </w:t>
+      </w:r>
+      <w:r>
+        <w:rPr>
+          <w:highlight w:val="yellow"/>
+        </w:rPr>
+        <w:t>that rank each sensor in priority order.</w:t>
+      </w:r>
+      <w:r>
+        <w:t xml:space="preserve"> </w:t>
       </w:r>
     </w:p>
     <w:p>
@@ -699,7 +742,6 @@
         <w:spacing w:before="120"/>
       </w:pPr>
       <w:r>
-        <w:lastRenderedPageBreak/>
         <w:t xml:space="preserve">A </w:t>
       </w:r>
       <w:r>
@@ -740,12 +782,21 @@
       <w:r>
         <w:t xml:space="preserve">Suppose </w:t>
       </w:r>
+      <w:proofErr w:type="gramStart"/>
       <w:r>
         <w:rPr>
           <w:rFonts w:ascii="Lucida Console" w:hAnsi="Lucida Console"/>
           <w:b/>
         </w:rPr>
-        <w:t>KV[72]</w:t>
+        <w:t>KV[</w:t>
+      </w:r>
+      <w:proofErr w:type="gramEnd"/>
+      <w:r>
+        <w:rPr>
+          <w:rFonts w:ascii="Lucida Console" w:hAnsi="Lucida Console"/>
+          <w:b/>
+        </w:rPr>
+        <w:t>72]</w:t>
       </w:r>
       <w:r>
         <w:t>=”</w:t>
@@ -870,6 +921,139 @@
       <w:r>
         <w:t>directly?</w:t>
       </w:r>
+      <w:r>
+        <w:t xml:space="preserve"> </w:t>
+      </w:r>
+    </w:p>
+    <w:p>
+      <w:pPr>
+        <w:pStyle w:val="p2"/>
+        <w:spacing w:before="120"/>
+        <w:ind w:left="1440"/>
+        <w:rPr>
+          <w:highlight w:val="yellow"/>
+        </w:rPr>
+      </w:pPr>
+      <w:r>
+        <w:rPr>
+          <w:highlight w:val="yellow"/>
+        </w:rPr>
+        <w:t>The OS won’t allow a user to enter</w:t>
+      </w:r>
+      <w:r>
+        <w:rPr>
+          <w:highlight w:val="yellow"/>
+        </w:rPr>
+        <w:t xml:space="preserve"> the kernel due to security measures designed by the OS programmers. </w:t>
+      </w:r>
+      <w:r>
+        <w:rPr>
+          <w:highlight w:val="yellow"/>
+        </w:rPr>
+        <w:t xml:space="preserve">The kernel </w:t>
+      </w:r>
+      <w:r>
+        <w:rPr>
+          <w:highlight w:val="yellow"/>
+        </w:rPr>
+        <w:t xml:space="preserve">completes the request through a hidden process on behalf of the user. </w:t>
+      </w:r>
+    </w:p>
+    <w:p>
+      <w:pPr>
+        <w:pStyle w:val="p2"/>
+        <w:spacing w:before="120"/>
+        <w:ind w:left="1440"/>
+      </w:pPr>
+      <w:r>
+        <w:rPr>
+          <w:highlight w:val="yellow"/>
+        </w:rPr>
+        <w:t xml:space="preserve">Allowing the user to invoke a call allowing them to access kernel space directly is a major security concern. </w:t>
+      </w:r>
+      <w:r>
+        <w:rPr>
+          <w:highlight w:val="yellow"/>
+        </w:rPr>
+        <w:t xml:space="preserve">An attacker can </w:t>
+      </w:r>
+      <w:r>
+        <w:rPr>
+          <w:highlight w:val="yellow"/>
+        </w:rPr>
+        <w:t xml:space="preserve">enter </w:t>
+      </w:r>
+      <w:r>
+        <w:rPr>
+          <w:highlight w:val="yellow"/>
+        </w:rPr>
+        <w:t xml:space="preserve">kernel space </w:t>
+      </w:r>
+      <w:r>
+        <w:rPr>
+          <w:highlight w:val="yellow"/>
+        </w:rPr>
+        <w:t xml:space="preserve">through a call and then overwrite </w:t>
+      </w:r>
+      <w:r>
+        <w:rPr>
+          <w:highlight w:val="yellow"/>
+        </w:rPr>
+        <w:t>kernel memory wit</w:t>
+      </w:r>
+      <w:r>
+        <w:rPr>
+          <w:highlight w:val="yellow"/>
+        </w:rPr>
+        <w:t xml:space="preserve">h malware that they have created. </w:t>
+      </w:r>
+      <w:proofErr w:type="gramStart"/>
+      <w:r>
+        <w:rPr>
+          <w:highlight w:val="yellow"/>
+        </w:rPr>
+        <w:t>In order to</w:t>
+      </w:r>
+      <w:proofErr w:type="gramEnd"/>
+      <w:r>
+        <w:rPr>
+          <w:highlight w:val="yellow"/>
+        </w:rPr>
+        <w:t xml:space="preserve"> prevent the user from accessing this protected part of memory, and further masking its exact location, we add a layer of indirection</w:t>
+      </w:r>
+      <w:r>
+        <w:rPr>
+          <w:highlight w:val="yellow"/>
+        </w:rPr>
+        <w:t xml:space="preserve">. The only way for the machine to enter kernel mode and subsequently enter </w:t>
+      </w:r>
+      <w:r>
+        <w:rPr>
+          <w:highlight w:val="yellow"/>
+        </w:rPr>
+        <w:t>the microkernel is with a</w:t>
+      </w:r>
+      <w:r>
+        <w:rPr>
+          <w:highlight w:val="yellow"/>
+        </w:rPr>
+        <w:t>n</w:t>
+      </w:r>
+      <w:r>
+        <w:rPr>
+          <w:highlight w:val="yellow"/>
+        </w:rPr>
+        <w:t xml:space="preserve"> </w:t>
+      </w:r>
+      <w:r>
+        <w:rPr>
+          <w:highlight w:val="yellow"/>
+        </w:rPr>
+        <w:t>interrupt created by the selector.</w:t>
+      </w:r>
+      <w:r>
+        <w:t xml:space="preserve"> </w:t>
+      </w:r>
     </w:p>
     <w:p>
       <w:pPr>
@@ -881,6 +1065,7 @@
         <w:spacing w:before="120"/>
       </w:pPr>
       <w:r>
+        <w:lastRenderedPageBreak/>
         <w:t xml:space="preserve">If the kernel routine to be called is in the microkernel (such as </w:t>
       </w:r>
       <w:r>
@@ -893,11 +1078,9 @@
       <w:r>
         <w:t xml:space="preserve">), the CPU must be put into kernel mode as part of the </w:t>
       </w:r>
-      <w:proofErr w:type="gramStart"/>
-      <w:r>
-        <w:t>call, and</w:t>
-      </w:r>
-      <w:proofErr w:type="gramEnd"/>
+      <w:r>
+        <w:t>call and</w:t>
+      </w:r>
       <w:r>
         <w:t xml:space="preserve"> must be restored to the </w:t>
       </w:r>
@@ -928,6 +1111,35 @@
       </w:r>
       <w:r>
         <w:t>on return?</w:t>
+      </w:r>
+    </w:p>
+    <w:p>
+      <w:pPr>
+        <w:pStyle w:val="p2"/>
+        <w:spacing w:before="120" w:line="259" w:lineRule="auto"/>
+        <w:ind w:left="720"/>
+        <w:rPr>
+          <w:highlight w:val="yellow"/>
+        </w:rPr>
+      </w:pPr>
+      <w:r>
+        <w:rPr>
+          <w:highlight w:val="yellow"/>
+        </w:rPr>
+        <w:t>When the source code is compiled into assembly, there are certain calls within the code that issue kernel requests. The KC instruction itself generates an interrupt signal, and the interrupt handler is triggered. As part of this interrupt, the CPU hardware automatically enters kernel mode by setting the kernel-state bit to 1 in the PSW. The KC handler creates a kernel vector with an entry point into private kernel space and KC implements the call on behalf of the user.</w:t>
+      </w:r>
+    </w:p>
+    <w:p>
+      <w:pPr>
+        <w:pStyle w:val="p2"/>
+        <w:spacing w:before="120" w:line="259" w:lineRule="auto"/>
+        <w:ind w:left="720"/>
+      </w:pPr>
+      <w:r>
+        <w:rPr>
+          <w:highlight w:val="yellow"/>
+        </w:rPr>
+        <w:t>When the kernel function completes execution, it returns. This return leads back to the interrupt handler which itself completes with a RET (return) instruction. Since the Activation Record set up by the dispatcher holds the original PSW (which contained the user-mode state), this saved PSW is automatically restored when the activation record is popped from the stack during the return process, automatically switching the CPU back to user mode and allowing the process to continue normal instruction execution.</w:t>
       </w:r>
     </w:p>
     <w:p>
@@ -992,6 +1204,229 @@
       <w:r>
         <w:t xml:space="preserve"> If it is not valid, what is a proper way to return from a kernel call?</w:t>
       </w:r>
+    </w:p>
+    <w:p>
+      <w:pPr>
+        <w:pStyle w:val="p2"/>
+        <w:spacing w:before="120"/>
+        <w:ind w:left="1440"/>
+        <w:rPr>
+          <w:highlight w:val="yellow"/>
+        </w:rPr>
+      </w:pPr>
+      <w:r>
+        <w:rPr>
+          <w:highlight w:val="yellow"/>
+        </w:rPr>
+        <w:t>No this is not valid. Th</w:t>
+      </w:r>
+      <w:r>
+        <w:rPr>
+          <w:highlight w:val="yellow"/>
+        </w:rPr>
+        <w:t>at is because:</w:t>
+      </w:r>
+    </w:p>
+    <w:p>
+      <w:pPr>
+        <w:pStyle w:val="ListParagraph"/>
+        <w:numPr>
+          <w:ilvl w:val="0"/>
+          <w:numId w:val="24"/>
+        </w:numPr>
+        <w:rPr>
+          <w:highlight w:val="yellow"/>
+        </w:rPr>
+      </w:pPr>
+      <w:r>
+        <w:rPr>
+          <w:highlight w:val="yellow"/>
+        </w:rPr>
+        <w:t>When a KC k (Kernel Call) instruction is executed, it generates an interrupt signal. As part of the CPU's "interrupt check" at the end of an instruction cycle, if an interrupt is detected, the CPU automatically enters kernel mode by setting the kernel-state bit in its Processor Status Word (PSW) to 1.</w:t>
+      </w:r>
+    </w:p>
+    <w:p>
+      <w:pPr>
+        <w:pStyle w:val="ListParagraph"/>
+        <w:numPr>
+          <w:ilvl w:val="0"/>
+          <w:numId w:val="24"/>
+        </w:numPr>
+        <w:rPr>
+          <w:highlight w:val="yellow"/>
+        </w:rPr>
+      </w:pPr>
+      <w:r>
+        <w:rPr>
+          <w:highlight w:val="yellow"/>
+        </w:rPr>
+        <w:t xml:space="preserve">During this interrupt handling, the dispatcher software sets up an Activation Record (AR) for the interrupt handler. This AR saves the CPU's current PSW </w:t>
+      </w:r>
+      <w:r>
+        <w:rPr>
+          <w:highlight w:val="yellow"/>
+        </w:rPr>
+        <w:t>(holding</w:t>
+      </w:r>
+      <w:r>
+        <w:rPr>
+          <w:highlight w:val="yellow"/>
+        </w:rPr>
+        <w:t xml:space="preserve"> original user state) and the Program Counter (IP) </w:t>
+      </w:r>
+      <w:proofErr w:type="gramStart"/>
+      <w:r>
+        <w:rPr>
+          <w:highlight w:val="yellow"/>
+        </w:rPr>
+        <w:t>( points</w:t>
+      </w:r>
+      <w:proofErr w:type="gramEnd"/>
+      <w:r>
+        <w:rPr>
+          <w:highlight w:val="yellow"/>
+        </w:rPr>
+        <w:t xml:space="preserve"> to the interrupted instruction). </w:t>
+      </w:r>
+    </w:p>
+    <w:p>
+      <w:pPr>
+        <w:pStyle w:val="ListParagraph"/>
+        <w:numPr>
+          <w:ilvl w:val="0"/>
+          <w:numId w:val="24"/>
+        </w:numPr>
+        <w:rPr>
+          <w:highlight w:val="yellow"/>
+        </w:rPr>
+      </w:pPr>
+      <w:r>
+        <w:rPr>
+          <w:highlight w:val="yellow"/>
+        </w:rPr>
+        <w:t xml:space="preserve">Security and Control: This mode switching is an orchestrated hardware/OS function, not something that a specific kernel routine itself should explicitly command. Kernel routines are privileged and require protected entry; the exit mechanism is similarly controlled by the system to maintain integrity. </w:t>
+      </w:r>
+    </w:p>
+    <w:p>
+      <w:r>
+        <w:t xml:space="preserve">The proper way for a kernel </w:t>
+      </w:r>
+      <w:r>
+        <w:t>function</w:t>
+      </w:r>
+      <w:r>
+        <w:t xml:space="preserve"> </w:t>
+      </w:r>
+      <w:r>
+        <w:t>to</w:t>
+      </w:r>
+      <w:r>
+        <w:t xml:space="preserve"> return is through a standard RET (return) instruction:</w:t>
+      </w:r>
+    </w:p>
+    <w:p>
+      <w:pPr>
+        <w:pStyle w:val="ListParagraph"/>
+        <w:numPr>
+          <w:ilvl w:val="0"/>
+          <w:numId w:val="25"/>
+        </w:numPr>
+        <w:rPr>
+          <w:highlight w:val="yellow"/>
+        </w:rPr>
+      </w:pPr>
+      <w:r>
+        <w:rPr>
+          <w:highlight w:val="yellow"/>
+        </w:rPr>
+        <w:t>Kernel Function Execution: The kernel function completes its tasks while in kernel mode.</w:t>
+      </w:r>
+    </w:p>
+    <w:p>
+      <w:pPr>
+        <w:pStyle w:val="ListParagraph"/>
+        <w:numPr>
+          <w:ilvl w:val="0"/>
+          <w:numId w:val="25"/>
+        </w:numPr>
+        <w:rPr>
+          <w:highlight w:val="yellow"/>
+        </w:rPr>
+      </w:pPr>
+      <w:r>
+        <w:rPr>
+          <w:highlight w:val="yellow"/>
+        </w:rPr>
+        <w:t>RET Instruction</w:t>
+      </w:r>
+    </w:p>
+    <w:p>
+      <w:pPr>
+        <w:pStyle w:val="ListParagraph"/>
+        <w:numPr>
+          <w:ilvl w:val="0"/>
+          <w:numId w:val="25"/>
+        </w:numPr>
+        <w:rPr>
+          <w:highlight w:val="yellow"/>
+        </w:rPr>
+      </w:pPr>
+      <w:r>
+        <w:rPr>
+          <w:highlight w:val="yellow"/>
+        </w:rPr>
+        <w:lastRenderedPageBreak/>
+        <w:t>Activation Record Pop: The RET instruction pop</w:t>
+      </w:r>
+      <w:r>
+        <w:rPr>
+          <w:highlight w:val="yellow"/>
+        </w:rPr>
+        <w:t>s</w:t>
+      </w:r>
+      <w:r>
+        <w:rPr>
+          <w:highlight w:val="yellow"/>
+        </w:rPr>
+        <w:t xml:space="preserve"> the Activation Record (AR) from the call stack.</w:t>
+      </w:r>
+    </w:p>
+    <w:p>
+      <w:pPr>
+        <w:pStyle w:val="ListParagraph"/>
+        <w:numPr>
+          <w:ilvl w:val="0"/>
+          <w:numId w:val="25"/>
+        </w:numPr>
+        <w:rPr>
+          <w:highlight w:val="yellow"/>
+        </w:rPr>
+      </w:pPr>
+      <w:r>
+        <w:rPr>
+          <w:highlight w:val="yellow"/>
+        </w:rPr>
+        <w:t>State Restoration and Mode Reversion: Popping the AR restores the saved PSW (which contains the original kernel-state bit value, typically 0 for user mode) and the saved IP to the CPU. This action automatically restores the CPU to user mode (setting the kernel-state bit back to 0) and resumes execution of the interrupted user program at the point it left off. The OS is "coded to switch... back again to 0 when the kernel state is no longer required".</w:t>
+      </w:r>
+    </w:p>
+    <w:p>
+      <w:pPr>
+        <w:pStyle w:val="p2"/>
+        <w:spacing w:before="120"/>
+        <w:ind w:left="1440"/>
+      </w:pPr>
+      <w:r>
+        <w:t xml:space="preserve">  </w:t>
+      </w:r>
+      <w:r>
+        <w:t xml:space="preserve"> </w:t>
+      </w:r>
+    </w:p>
+    <w:p>
+      <w:pPr>
+        <w:pStyle w:val="p2"/>
+        <w:spacing w:before="120"/>
+      </w:pPr>
     </w:p>
     <w:sectPr>
       <w:pgSz w:w="12240" w:h="15840"/>
@@ -1003,7 +1438,7 @@
 </file>
 
 <file path=word/numbering.xml><?xml version="1.0" encoding="utf-8"?>
-<w:numbering xmlns:wpc="http://schemas.microsoft.com/office/word/2010/wordprocessingCanvas" xmlns:cx="http://schemas.microsoft.com/office/drawing/2014/chartex" xmlns:cx1="http://schemas.microsoft.com/office/drawing/2015/9/8/chartex" xmlns:cx2="http://schemas.microsoft.com/office/drawing/2015/10/21/chartex" xmlns:cx3="http://schemas.microsoft.com/office/drawing/2016/5/9/chartex" xmlns:cx4="http://schemas.microsoft.com/office/drawing/2016/5/10/chartex" xmlns:cx5="http://schemas.microsoft.com/office/drawing/2016/5/11/chartex" xmlns:cx6="http://schemas.microsoft.com/office/drawing/2016/5/12/chartex" xmlns:cx7="http://schemas.microsoft.com/office/drawing/2016/5/13/chartex" xmlns:cx8="http://schemas.microsoft.com/office/drawing/2016/5/14/chartex" xmlns:mc="http://schemas.openxmlformats.org/markup-compatibility/2006" xmlns:aink="http://schemas.microsoft.com/office/drawing/2016/ink" xmlns:am3d="http://schemas.microsoft.com/office/drawing/2017/model3d" xmlns:o="urn:schemas-microsoft-com:office:office" xmlns:oel="http://schemas.microsoft.com/office/2019/extlst" xmlns:r="http://schemas.openxmlformats.org/officeDocument/2006/relationships" xmlns:m="http://schemas.openxmlformats.org/officeDocument/2006/math" xmlns:v="urn:schemas-microsoft-com:vml" xmlns:wp14="http://schemas.microsoft.com/office/word/2010/wordprocessingDrawing" xmlns:wp="http://schemas.openxmlformats.org/drawingml/2006/wordprocessingDrawing" xmlns:w10="urn:schemas-microsoft-com:office:word" xmlns:w="http://schemas.openxmlformats.org/wordprocessingml/2006/main" xmlns:w14="http://schemas.microsoft.com/office/word/2010/wordml" xmlns:w15="http://schemas.microsoft.com/office/word/2012/wordml" xmlns:w16cex="http://schemas.microsoft.com/office/word/2018/wordml/cex" xmlns:w16cid="http://schemas.microsoft.com/office/word/2016/wordml/cid" xmlns:w16="http://schemas.microsoft.com/office/word/2018/wordml" xmlns:w16du="http://schemas.microsoft.com/office/word/2023/wordml/word16du" xmlns:w16sdtdh="http://schemas.microsoft.com/office/word/2020/wordml/sdtdatahash" xmlns:w16sdtfl="http://schemas.microsoft.com/office/word/2024/wordml/sdtformatlock" xmlns:w16se="http://schemas.microsoft.com/office/word/2015/wordml/symex" xmlns:wpg="http://schemas.microsoft.com/office/word/2010/wordprocessingGroup" xmlns:wpi="http://schemas.microsoft.com/office/word/2010/wordprocessingInk" xmlns:wne="http://schemas.microsoft.com/office/word/2006/wordml" xmlns:wps="http://schemas.microsoft.com/office/word/2010/wordprocessingShape" mc:Ignorable="w14 w15 w16se w16cid w16 w16cex w16sdtdh w16sdtfl w16du wp14">
+<w:numbering xmlns:wpc="http://schemas.microsoft.com/office/word/2010/wordprocessingCanvas" xmlns:cx="http://schemas.microsoft.com/office/drawing/2014/chartex" xmlns:cx1="http://schemas.microsoft.com/office/drawing/2015/9/8/chartex" xmlns:cx2="http://schemas.microsoft.com/office/drawing/2015/10/21/chartex" xmlns:cx3="http://schemas.microsoft.com/office/drawing/2016/5/9/chartex" xmlns:cx4="http://schemas.microsoft.com/office/drawing/2016/5/10/chartex" xmlns:cx5="http://schemas.microsoft.com/office/drawing/2016/5/11/chartex" xmlns:cx6="http://schemas.microsoft.com/office/drawing/2016/5/12/chartex" xmlns:cx7="http://schemas.microsoft.com/office/drawing/2016/5/13/chartex" xmlns:cx8="http://schemas.microsoft.com/office/drawing/2016/5/14/chartex" xmlns:mc="http://schemas.openxmlformats.org/markup-compatibility/2006" xmlns:aink="http://schemas.microsoft.com/office/drawing/2016/ink" xmlns:am3d="http://schemas.microsoft.com/office/drawing/2017/model3d" xmlns:o="urn:schemas-microsoft-com:office:office" xmlns:oel="http://schemas.microsoft.com/office/2019/extlst" xmlns:r="http://schemas.openxmlformats.org/officeDocument/2006/relationships" xmlns:m="http://schemas.openxmlformats.org/officeDocument/2006/math" xmlns:v="urn:schemas-microsoft-com:vml" xmlns:wp14="http://schemas.microsoft.com/office/word/2010/wordprocessingDrawing" xmlns:wp="http://schemas.openxmlformats.org/drawingml/2006/wordprocessingDrawing" xmlns:w10="urn:schemas-microsoft-com:office:word" xmlns:w="http://schemas.openxmlformats.org/wordprocessingml/2006/main" xmlns:w14="http://schemas.microsoft.com/office/word/2010/wordml" xmlns:w15="http://schemas.microsoft.com/office/word/2012/wordml" xmlns:w16cex="http://schemas.microsoft.com/office/word/2018/wordml/cex" xmlns:w16cid="http://schemas.microsoft.com/office/word/2016/wordml/cid" xmlns:w16="http://schemas.microsoft.com/office/word/2018/wordml" xmlns:w16du="http://schemas.microsoft.com/office/word/2023/wordml/word16du" xmlns:w16sdtdh="http://schemas.microsoft.com/office/word/2020/wordml/sdtdatahash" xmlns:w16se="http://schemas.microsoft.com/office/word/2015/wordml/symex" xmlns:wpg="http://schemas.microsoft.com/office/word/2010/wordprocessingGroup" xmlns:wpi="http://schemas.microsoft.com/office/word/2010/wordprocessingInk" xmlns:wne="http://schemas.microsoft.com/office/word/2006/wordml" xmlns:wps="http://schemas.microsoft.com/office/word/2010/wordprocessingShape" mc:Ignorable="w14 w15 w16se w16cid w16 w16cex w16sdtdh w16du wp14">
   <w:abstractNum w:abstractNumId="0" w15:restartNumberingAfterBreak="0">
     <w:nsid w:val="06DB2C07"/>
     <w:multiLevelType w:val="hybridMultilevel"/>
@@ -1489,6 +1924,205 @@
     </w:lvl>
   </w:abstractNum>
   <w:abstractNum w:abstractNumId="5" w15:restartNumberingAfterBreak="0">
+    <w:nsid w:val="266F48C5"/>
+    <w:multiLevelType w:val="hybridMultilevel"/>
+    <w:tmpl w:val="FFFFFFFF"/>
+    <w:lvl w:ilvl="0" w:tplc="22A2E76C">
+      <w:start w:val="1"/>
+      <w:numFmt w:val="bullet"/>
+      <w:lvlText w:val=""/>
+      <w:lvlJc w:val="left"/>
+      <w:pPr>
+        <w:ind w:left="1080" w:hanging="360"/>
+      </w:pPr>
+      <w:rPr>
+        <w:rFonts w:ascii="Symbol" w:hAnsi="Symbol" w:hint="default"/>
+      </w:rPr>
+    </w:lvl>
+    <w:lvl w:ilvl="1" w:tplc="E0525AB0">
+      <w:start w:val="1"/>
+      <w:numFmt w:val="bullet"/>
+      <w:lvlText w:val="o"/>
+      <w:lvlJc w:val="left"/>
+      <w:pPr>
+        <w:ind w:left="1800" w:hanging="360"/>
+      </w:pPr>
+      <w:rPr>
+        <w:rFonts w:ascii="Courier New" w:hAnsi="Courier New" w:hint="default"/>
+      </w:rPr>
+    </w:lvl>
+    <w:lvl w:ilvl="2" w:tplc="6EF0602C">
+      <w:start w:val="1"/>
+      <w:numFmt w:val="bullet"/>
+      <w:lvlText w:val=""/>
+      <w:lvlJc w:val="left"/>
+      <w:pPr>
+        <w:ind w:left="2520" w:hanging="360"/>
+      </w:pPr>
+      <w:rPr>
+        <w:rFonts w:ascii="Wingdings" w:hAnsi="Wingdings" w:hint="default"/>
+      </w:rPr>
+    </w:lvl>
+    <w:lvl w:ilvl="3" w:tplc="0EF299CA">
+      <w:start w:val="1"/>
+      <w:numFmt w:val="bullet"/>
+      <w:lvlText w:val=""/>
+      <w:lvlJc w:val="left"/>
+      <w:pPr>
+        <w:ind w:left="3240" w:hanging="360"/>
+      </w:pPr>
+      <w:rPr>
+        <w:rFonts w:ascii="Symbol" w:hAnsi="Symbol" w:hint="default"/>
+      </w:rPr>
+    </w:lvl>
+    <w:lvl w:ilvl="4" w:tplc="5D6EB76A">
+      <w:start w:val="1"/>
+      <w:numFmt w:val="bullet"/>
+      <w:lvlText w:val="o"/>
+      <w:lvlJc w:val="left"/>
+      <w:pPr>
+        <w:ind w:left="3960" w:hanging="360"/>
+      </w:pPr>
+      <w:rPr>
+        <w:rFonts w:ascii="Courier New" w:hAnsi="Courier New" w:hint="default"/>
+      </w:rPr>
+    </w:lvl>
+    <w:lvl w:ilvl="5" w:tplc="EDEC047A">
+      <w:start w:val="1"/>
+      <w:numFmt w:val="bullet"/>
+      <w:lvlText w:val=""/>
+      <w:lvlJc w:val="left"/>
+      <w:pPr>
+        <w:ind w:left="4680" w:hanging="360"/>
+      </w:pPr>
+      <w:rPr>
+        <w:rFonts w:ascii="Wingdings" w:hAnsi="Wingdings" w:hint="default"/>
+      </w:rPr>
+    </w:lvl>
+    <w:lvl w:ilvl="6" w:tplc="FCCE2A36">
+      <w:start w:val="1"/>
+      <w:numFmt w:val="bullet"/>
+      <w:lvlText w:val=""/>
+      <w:lvlJc w:val="left"/>
+      <w:pPr>
+        <w:ind w:left="5400" w:hanging="360"/>
+      </w:pPr>
+      <w:rPr>
+        <w:rFonts w:ascii="Symbol" w:hAnsi="Symbol" w:hint="default"/>
+      </w:rPr>
+    </w:lvl>
+    <w:lvl w:ilvl="7" w:tplc="9D4CF3EE">
+      <w:start w:val="1"/>
+      <w:numFmt w:val="bullet"/>
+      <w:lvlText w:val="o"/>
+      <w:lvlJc w:val="left"/>
+      <w:pPr>
+        <w:ind w:left="6120" w:hanging="360"/>
+      </w:pPr>
+      <w:rPr>
+        <w:rFonts w:ascii="Courier New" w:hAnsi="Courier New" w:hint="default"/>
+      </w:rPr>
+    </w:lvl>
+    <w:lvl w:ilvl="8" w:tplc="AE42C3F2">
+      <w:start w:val="1"/>
+      <w:numFmt w:val="bullet"/>
+      <w:lvlText w:val=""/>
+      <w:lvlJc w:val="left"/>
+      <w:pPr>
+        <w:ind w:left="6840" w:hanging="360"/>
+      </w:pPr>
+      <w:rPr>
+        <w:rFonts w:ascii="Wingdings" w:hAnsi="Wingdings" w:hint="default"/>
+      </w:rPr>
+    </w:lvl>
+  </w:abstractNum>
+  <w:abstractNum w:abstractNumId="6" w15:restartNumberingAfterBreak="0">
+    <w:nsid w:val="2E8FE1D3"/>
+    <w:multiLevelType w:val="hybridMultilevel"/>
+    <w:tmpl w:val="FFFFFFFF"/>
+    <w:lvl w:ilvl="0" w:tplc="4242330A">
+      <w:start w:val="1"/>
+      <w:numFmt w:val="decimal"/>
+      <w:lvlText w:val="%1."/>
+      <w:lvlJc w:val="left"/>
+      <w:pPr>
+        <w:ind w:left="720" w:hanging="360"/>
+      </w:pPr>
+    </w:lvl>
+    <w:lvl w:ilvl="1" w:tplc="9104E3EA">
+      <w:start w:val="1"/>
+      <w:numFmt w:val="lowerLetter"/>
+      <w:lvlText w:val="%2."/>
+      <w:lvlJc w:val="left"/>
+      <w:pPr>
+        <w:ind w:left="1440" w:hanging="360"/>
+      </w:pPr>
+    </w:lvl>
+    <w:lvl w:ilvl="2" w:tplc="3ACAAB68">
+      <w:start w:val="1"/>
+      <w:numFmt w:val="lowerRoman"/>
+      <w:lvlText w:val="%3."/>
+      <w:lvlJc w:val="right"/>
+      <w:pPr>
+        <w:ind w:left="2160" w:hanging="180"/>
+      </w:pPr>
+    </w:lvl>
+    <w:lvl w:ilvl="3" w:tplc="3064C7CC">
+      <w:start w:val="1"/>
+      <w:numFmt w:val="decimal"/>
+      <w:lvlText w:val="%4."/>
+      <w:lvlJc w:val="left"/>
+      <w:pPr>
+        <w:ind w:left="2880" w:hanging="360"/>
+      </w:pPr>
+    </w:lvl>
+    <w:lvl w:ilvl="4" w:tplc="7090B9DE">
+      <w:start w:val="1"/>
+      <w:numFmt w:val="lowerLetter"/>
+      <w:lvlText w:val="%5."/>
+      <w:lvlJc w:val="left"/>
+      <w:pPr>
+        <w:ind w:left="3600" w:hanging="360"/>
+      </w:pPr>
+    </w:lvl>
+    <w:lvl w:ilvl="5" w:tplc="2DBE4140">
+      <w:start w:val="1"/>
+      <w:numFmt w:val="lowerRoman"/>
+      <w:lvlText w:val="%6."/>
+      <w:lvlJc w:val="right"/>
+      <w:pPr>
+        <w:ind w:left="4320" w:hanging="180"/>
+      </w:pPr>
+    </w:lvl>
+    <w:lvl w:ilvl="6" w:tplc="8362BBC2">
+      <w:start w:val="1"/>
+      <w:numFmt w:val="decimal"/>
+      <w:lvlText w:val="%7."/>
+      <w:lvlJc w:val="left"/>
+      <w:pPr>
+        <w:ind w:left="5040" w:hanging="360"/>
+      </w:pPr>
+    </w:lvl>
+    <w:lvl w:ilvl="7" w:tplc="82C8D524">
+      <w:start w:val="1"/>
+      <w:numFmt w:val="lowerLetter"/>
+      <w:lvlText w:val="%8."/>
+      <w:lvlJc w:val="left"/>
+      <w:pPr>
+        <w:ind w:left="5760" w:hanging="360"/>
+      </w:pPr>
+    </w:lvl>
+    <w:lvl w:ilvl="8" w:tplc="652E2D12">
+      <w:start w:val="1"/>
+      <w:numFmt w:val="lowerRoman"/>
+      <w:lvlText w:val="%9."/>
+      <w:lvlJc w:val="right"/>
+      <w:pPr>
+        <w:ind w:left="6480" w:hanging="180"/>
+      </w:pPr>
+    </w:lvl>
+  </w:abstractNum>
+  <w:abstractNum w:abstractNumId="7" w15:restartNumberingAfterBreak="0">
     <w:nsid w:val="2EBA4988"/>
     <w:multiLevelType w:val="hybridMultilevel"/>
     <w:tmpl w:val="51327BC4"/>
@@ -1601,7 +2235,93 @@
       </w:rPr>
     </w:lvl>
   </w:abstractNum>
-  <w:abstractNum w:abstractNumId="6" w15:restartNumberingAfterBreak="0">
+  <w:abstractNum w:abstractNumId="8" w15:restartNumberingAfterBreak="0">
+    <w:nsid w:val="36F3B451"/>
+    <w:multiLevelType w:val="hybridMultilevel"/>
+    <w:tmpl w:val="FFFFFFFF"/>
+    <w:lvl w:ilvl="0" w:tplc="CA3A98CA">
+      <w:start w:val="1"/>
+      <w:numFmt w:val="decimal"/>
+      <w:lvlText w:val="%1."/>
+      <w:lvlJc w:val="left"/>
+      <w:pPr>
+        <w:ind w:left="720" w:hanging="360"/>
+      </w:pPr>
+    </w:lvl>
+    <w:lvl w:ilvl="1" w:tplc="08225A26">
+      <w:start w:val="1"/>
+      <w:numFmt w:val="lowerLetter"/>
+      <w:lvlText w:val="%2."/>
+      <w:lvlJc w:val="left"/>
+      <w:pPr>
+        <w:ind w:left="1440" w:hanging="360"/>
+      </w:pPr>
+    </w:lvl>
+    <w:lvl w:ilvl="2" w:tplc="F22AEC38">
+      <w:start w:val="1"/>
+      <w:numFmt w:val="lowerRoman"/>
+      <w:lvlText w:val="%3."/>
+      <w:lvlJc w:val="right"/>
+      <w:pPr>
+        <w:ind w:left="2160" w:hanging="180"/>
+      </w:pPr>
+    </w:lvl>
+    <w:lvl w:ilvl="3" w:tplc="C1742960">
+      <w:start w:val="1"/>
+      <w:numFmt w:val="decimal"/>
+      <w:lvlText w:val="%4."/>
+      <w:lvlJc w:val="left"/>
+      <w:pPr>
+        <w:ind w:left="2880" w:hanging="360"/>
+      </w:pPr>
+    </w:lvl>
+    <w:lvl w:ilvl="4" w:tplc="CDF8440E">
+      <w:start w:val="1"/>
+      <w:numFmt w:val="lowerLetter"/>
+      <w:lvlText w:val="%5."/>
+      <w:lvlJc w:val="left"/>
+      <w:pPr>
+        <w:ind w:left="3600" w:hanging="360"/>
+      </w:pPr>
+    </w:lvl>
+    <w:lvl w:ilvl="5" w:tplc="45C40274">
+      <w:start w:val="1"/>
+      <w:numFmt w:val="lowerRoman"/>
+      <w:lvlText w:val="%6."/>
+      <w:lvlJc w:val="right"/>
+      <w:pPr>
+        <w:ind w:left="4320" w:hanging="180"/>
+      </w:pPr>
+    </w:lvl>
+    <w:lvl w:ilvl="6" w:tplc="77486E42">
+      <w:start w:val="1"/>
+      <w:numFmt w:val="decimal"/>
+      <w:lvlText w:val="%7."/>
+      <w:lvlJc w:val="left"/>
+      <w:pPr>
+        <w:ind w:left="5040" w:hanging="360"/>
+      </w:pPr>
+    </w:lvl>
+    <w:lvl w:ilvl="7" w:tplc="680C2140">
+      <w:start w:val="1"/>
+      <w:numFmt w:val="lowerLetter"/>
+      <w:lvlText w:val="%8."/>
+      <w:lvlJc w:val="left"/>
+      <w:pPr>
+        <w:ind w:left="5760" w:hanging="360"/>
+      </w:pPr>
+    </w:lvl>
+    <w:lvl w:ilvl="8" w:tplc="D9F0533E">
+      <w:start w:val="1"/>
+      <w:numFmt w:val="lowerRoman"/>
+      <w:lvlText w:val="%9."/>
+      <w:lvlJc w:val="right"/>
+      <w:pPr>
+        <w:ind w:left="6480" w:hanging="180"/>
+      </w:pPr>
+    </w:lvl>
+  </w:abstractNum>
+  <w:abstractNum w:abstractNumId="9" w15:restartNumberingAfterBreak="0">
     <w:nsid w:val="378522DF"/>
     <w:multiLevelType w:val="multilevel"/>
     <w:tmpl w:val="5302062A"/>
@@ -1687,7 +2407,120 @@
       </w:pPr>
     </w:lvl>
   </w:abstractNum>
-  <w:abstractNum w:abstractNumId="7" w15:restartNumberingAfterBreak="0">
+  <w:abstractNum w:abstractNumId="10" w15:restartNumberingAfterBreak="0">
+    <w:nsid w:val="3C3EE764"/>
+    <w:multiLevelType w:val="hybridMultilevel"/>
+    <w:tmpl w:val="FFFFFFFF"/>
+    <w:lvl w:ilvl="0" w:tplc="F0BAAB9C">
+      <w:start w:val="1"/>
+      <w:numFmt w:val="bullet"/>
+      <w:lvlText w:val=""/>
+      <w:lvlJc w:val="left"/>
+      <w:pPr>
+        <w:ind w:left="1080" w:hanging="360"/>
+      </w:pPr>
+      <w:rPr>
+        <w:rFonts w:ascii="Symbol" w:hAnsi="Symbol" w:hint="default"/>
+      </w:rPr>
+    </w:lvl>
+    <w:lvl w:ilvl="1" w:tplc="0E7CF0E6">
+      <w:start w:val="1"/>
+      <w:numFmt w:val="bullet"/>
+      <w:lvlText w:val="o"/>
+      <w:lvlJc w:val="left"/>
+      <w:pPr>
+        <w:ind w:left="1800" w:hanging="360"/>
+      </w:pPr>
+      <w:rPr>
+        <w:rFonts w:ascii="Courier New" w:hAnsi="Courier New" w:hint="default"/>
+      </w:rPr>
+    </w:lvl>
+    <w:lvl w:ilvl="2" w:tplc="30A44DF8">
+      <w:start w:val="1"/>
+      <w:numFmt w:val="bullet"/>
+      <w:lvlText w:val=""/>
+      <w:lvlJc w:val="left"/>
+      <w:pPr>
+        <w:ind w:left="2520" w:hanging="360"/>
+      </w:pPr>
+      <w:rPr>
+        <w:rFonts w:ascii="Wingdings" w:hAnsi="Wingdings" w:hint="default"/>
+      </w:rPr>
+    </w:lvl>
+    <w:lvl w:ilvl="3" w:tplc="9D0A2C30">
+      <w:start w:val="1"/>
+      <w:numFmt w:val="bullet"/>
+      <w:lvlText w:val=""/>
+      <w:lvlJc w:val="left"/>
+      <w:pPr>
+        <w:ind w:left="3240" w:hanging="360"/>
+      </w:pPr>
+      <w:rPr>
+        <w:rFonts w:ascii="Symbol" w:hAnsi="Symbol" w:hint="default"/>
+      </w:rPr>
+    </w:lvl>
+    <w:lvl w:ilvl="4" w:tplc="AEE4F4C6">
+      <w:start w:val="1"/>
+      <w:numFmt w:val="bullet"/>
+      <w:lvlText w:val="o"/>
+      <w:lvlJc w:val="left"/>
+      <w:pPr>
+        <w:ind w:left="3960" w:hanging="360"/>
+      </w:pPr>
+      <w:rPr>
+        <w:rFonts w:ascii="Courier New" w:hAnsi="Courier New" w:hint="default"/>
+      </w:rPr>
+    </w:lvl>
+    <w:lvl w:ilvl="5" w:tplc="F1922D4C">
+      <w:start w:val="1"/>
+      <w:numFmt w:val="bullet"/>
+      <w:lvlText w:val=""/>
+      <w:lvlJc w:val="left"/>
+      <w:pPr>
+        <w:ind w:left="4680" w:hanging="360"/>
+      </w:pPr>
+      <w:rPr>
+        <w:rFonts w:ascii="Wingdings" w:hAnsi="Wingdings" w:hint="default"/>
+      </w:rPr>
+    </w:lvl>
+    <w:lvl w:ilvl="6" w:tplc="4552EB7C">
+      <w:start w:val="1"/>
+      <w:numFmt w:val="bullet"/>
+      <w:lvlText w:val=""/>
+      <w:lvlJc w:val="left"/>
+      <w:pPr>
+        <w:ind w:left="5400" w:hanging="360"/>
+      </w:pPr>
+      <w:rPr>
+        <w:rFonts w:ascii="Symbol" w:hAnsi="Symbol" w:hint="default"/>
+      </w:rPr>
+    </w:lvl>
+    <w:lvl w:ilvl="7" w:tplc="9594B8FC">
+      <w:start w:val="1"/>
+      <w:numFmt w:val="bullet"/>
+      <w:lvlText w:val="o"/>
+      <w:lvlJc w:val="left"/>
+      <w:pPr>
+        <w:ind w:left="6120" w:hanging="360"/>
+      </w:pPr>
+      <w:rPr>
+        <w:rFonts w:ascii="Courier New" w:hAnsi="Courier New" w:hint="default"/>
+      </w:rPr>
+    </w:lvl>
+    <w:lvl w:ilvl="8" w:tplc="46F4637A">
+      <w:start w:val="1"/>
+      <w:numFmt w:val="bullet"/>
+      <w:lvlText w:val=""/>
+      <w:lvlJc w:val="left"/>
+      <w:pPr>
+        <w:ind w:left="6840" w:hanging="360"/>
+      </w:pPr>
+      <w:rPr>
+        <w:rFonts w:ascii="Wingdings" w:hAnsi="Wingdings" w:hint="default"/>
+      </w:rPr>
+    </w:lvl>
+  </w:abstractNum>
+  <w:abstractNum w:abstractNumId="11" w15:restartNumberingAfterBreak="0">
     <w:nsid w:val="3E1C004E"/>
     <w:multiLevelType w:val="hybridMultilevel"/>
     <w:tmpl w:val="979E2882"/>
@@ -1773,7 +2606,7 @@
       </w:pPr>
     </w:lvl>
   </w:abstractNum>
-  <w:abstractNum w:abstractNumId="8" w15:restartNumberingAfterBreak="0">
+  <w:abstractNum w:abstractNumId="12" w15:restartNumberingAfterBreak="0">
     <w:nsid w:val="3E9B7AB7"/>
     <w:multiLevelType w:val="hybridMultilevel"/>
     <w:tmpl w:val="3ACE4350"/>
@@ -1886,7 +2719,93 @@
       </w:rPr>
     </w:lvl>
   </w:abstractNum>
-  <w:abstractNum w:abstractNumId="9" w15:restartNumberingAfterBreak="0">
+  <w:abstractNum w:abstractNumId="13" w15:restartNumberingAfterBreak="0">
+    <w:nsid w:val="44FFB2A7"/>
+    <w:multiLevelType w:val="hybridMultilevel"/>
+    <w:tmpl w:val="FFFFFFFF"/>
+    <w:lvl w:ilvl="0" w:tplc="801C3B7C">
+      <w:start w:val="1"/>
+      <w:numFmt w:val="decimal"/>
+      <w:lvlText w:val="%1."/>
+      <w:lvlJc w:val="left"/>
+      <w:pPr>
+        <w:ind w:left="720" w:hanging="360"/>
+      </w:pPr>
+    </w:lvl>
+    <w:lvl w:ilvl="1" w:tplc="608E7E1E">
+      <w:start w:val="1"/>
+      <w:numFmt w:val="lowerLetter"/>
+      <w:lvlText w:val="%2."/>
+      <w:lvlJc w:val="left"/>
+      <w:pPr>
+        <w:ind w:left="2520" w:hanging="360"/>
+      </w:pPr>
+    </w:lvl>
+    <w:lvl w:ilvl="2" w:tplc="B5B471CE">
+      <w:start w:val="1"/>
+      <w:numFmt w:val="lowerRoman"/>
+      <w:lvlText w:val="%3."/>
+      <w:lvlJc w:val="right"/>
+      <w:pPr>
+        <w:ind w:left="3240" w:hanging="180"/>
+      </w:pPr>
+    </w:lvl>
+    <w:lvl w:ilvl="3" w:tplc="7E002B76">
+      <w:start w:val="1"/>
+      <w:numFmt w:val="decimal"/>
+      <w:lvlText w:val="%4."/>
+      <w:lvlJc w:val="left"/>
+      <w:pPr>
+        <w:ind w:left="3960" w:hanging="360"/>
+      </w:pPr>
+    </w:lvl>
+    <w:lvl w:ilvl="4" w:tplc="C0DADB90">
+      <w:start w:val="1"/>
+      <w:numFmt w:val="lowerLetter"/>
+      <w:lvlText w:val="%5."/>
+      <w:lvlJc w:val="left"/>
+      <w:pPr>
+        <w:ind w:left="4680" w:hanging="360"/>
+      </w:pPr>
+    </w:lvl>
+    <w:lvl w:ilvl="5" w:tplc="DF52EC8E">
+      <w:start w:val="1"/>
+      <w:numFmt w:val="lowerRoman"/>
+      <w:lvlText w:val="%6."/>
+      <w:lvlJc w:val="right"/>
+      <w:pPr>
+        <w:ind w:left="5400" w:hanging="180"/>
+      </w:pPr>
+    </w:lvl>
+    <w:lvl w:ilvl="6" w:tplc="B0AE7A7E">
+      <w:start w:val="1"/>
+      <w:numFmt w:val="decimal"/>
+      <w:lvlText w:val="%7."/>
+      <w:lvlJc w:val="left"/>
+      <w:pPr>
+        <w:ind w:left="6120" w:hanging="360"/>
+      </w:pPr>
+    </w:lvl>
+    <w:lvl w:ilvl="7" w:tplc="B78609D8">
+      <w:start w:val="1"/>
+      <w:numFmt w:val="lowerLetter"/>
+      <w:lvlText w:val="%8."/>
+      <w:lvlJc w:val="left"/>
+      <w:pPr>
+        <w:ind w:left="6840" w:hanging="360"/>
+      </w:pPr>
+    </w:lvl>
+    <w:lvl w:ilvl="8" w:tplc="DC94BD1A">
+      <w:start w:val="1"/>
+      <w:numFmt w:val="lowerRoman"/>
+      <w:lvlText w:val="%9."/>
+      <w:lvlJc w:val="right"/>
+      <w:pPr>
+        <w:ind w:left="7560" w:hanging="180"/>
+      </w:pPr>
+    </w:lvl>
+  </w:abstractNum>
+  <w:abstractNum w:abstractNumId="14" w15:restartNumberingAfterBreak="0">
     <w:nsid w:val="490A49E6"/>
     <w:multiLevelType w:val="hybridMultilevel"/>
     <w:tmpl w:val="A3A22734"/>
@@ -1972,7 +2891,7 @@
       </w:pPr>
     </w:lvl>
   </w:abstractNum>
-  <w:abstractNum w:abstractNumId="10" w15:restartNumberingAfterBreak="0">
+  <w:abstractNum w:abstractNumId="15" w15:restartNumberingAfterBreak="0">
     <w:nsid w:val="4A6F4286"/>
     <w:multiLevelType w:val="hybridMultilevel"/>
     <w:tmpl w:val="87AEB898"/>
@@ -2058,7 +2977,7 @@
       </w:pPr>
     </w:lvl>
   </w:abstractNum>
-  <w:abstractNum w:abstractNumId="11" w15:restartNumberingAfterBreak="0">
+  <w:abstractNum w:abstractNumId="16" w15:restartNumberingAfterBreak="0">
     <w:nsid w:val="4EE7396E"/>
     <w:multiLevelType w:val="hybridMultilevel"/>
     <w:tmpl w:val="E424CBBA"/>
@@ -2171,7 +3090,7 @@
       </w:rPr>
     </w:lvl>
   </w:abstractNum>
-  <w:abstractNum w:abstractNumId="12" w15:restartNumberingAfterBreak="0">
+  <w:abstractNum w:abstractNumId="17" w15:restartNumberingAfterBreak="0">
     <w:nsid w:val="54922FD5"/>
     <w:multiLevelType w:val="hybridMultilevel"/>
     <w:tmpl w:val="74CAF6EE"/>
@@ -2284,7 +3203,7 @@
       </w:rPr>
     </w:lvl>
   </w:abstractNum>
-  <w:abstractNum w:abstractNumId="13" w15:restartNumberingAfterBreak="0">
+  <w:abstractNum w:abstractNumId="18" w15:restartNumberingAfterBreak="0">
     <w:nsid w:val="59D057CB"/>
     <w:multiLevelType w:val="hybridMultilevel"/>
     <w:tmpl w:val="AD447CBE"/>
@@ -2370,7 +3289,7 @@
       </w:pPr>
     </w:lvl>
   </w:abstractNum>
-  <w:abstractNum w:abstractNumId="14" w15:restartNumberingAfterBreak="0">
+  <w:abstractNum w:abstractNumId="19" w15:restartNumberingAfterBreak="0">
     <w:nsid w:val="5E3E48D4"/>
     <w:multiLevelType w:val="hybridMultilevel"/>
     <w:tmpl w:val="8308355E"/>
@@ -2483,7 +3402,7 @@
       </w:rPr>
     </w:lvl>
   </w:abstractNum>
-  <w:abstractNum w:abstractNumId="15" w15:restartNumberingAfterBreak="0">
+  <w:abstractNum w:abstractNumId="20" w15:restartNumberingAfterBreak="0">
     <w:nsid w:val="5F6D1E22"/>
     <w:multiLevelType w:val="hybridMultilevel"/>
     <w:tmpl w:val="73BA27A6"/>
@@ -2596,7 +3515,7 @@
       </w:rPr>
     </w:lvl>
   </w:abstractNum>
-  <w:abstractNum w:abstractNumId="16" w15:restartNumberingAfterBreak="0">
+  <w:abstractNum w:abstractNumId="21" w15:restartNumberingAfterBreak="0">
     <w:nsid w:val="61AF4ADF"/>
     <w:multiLevelType w:val="hybridMultilevel"/>
     <w:tmpl w:val="3F0644D8"/>
@@ -2682,7 +3601,7 @@
       </w:pPr>
     </w:lvl>
   </w:abstractNum>
-  <w:abstractNum w:abstractNumId="17" w15:restartNumberingAfterBreak="0">
+  <w:abstractNum w:abstractNumId="22" w15:restartNumberingAfterBreak="0">
     <w:nsid w:val="7281060F"/>
     <w:multiLevelType w:val="hybridMultilevel"/>
     <w:tmpl w:val="2D56BF40"/>
@@ -2795,7 +3714,7 @@
       </w:rPr>
     </w:lvl>
   </w:abstractNum>
-  <w:abstractNum w:abstractNumId="18" w15:restartNumberingAfterBreak="0">
+  <w:abstractNum w:abstractNumId="23" w15:restartNumberingAfterBreak="0">
     <w:nsid w:val="7D282AC0"/>
     <w:multiLevelType w:val="hybridMultilevel"/>
     <w:tmpl w:val="7BF85A64"/>
@@ -2881,7 +3800,7 @@
       </w:pPr>
     </w:lvl>
   </w:abstractNum>
-  <w:abstractNum w:abstractNumId="19" w15:restartNumberingAfterBreak="0">
+  <w:abstractNum w:abstractNumId="24" w15:restartNumberingAfterBreak="0">
     <w:nsid w:val="7D2A0B76"/>
     <w:multiLevelType w:val="hybridMultilevel"/>
     <w:tmpl w:val="B0625440"/>
@@ -2971,22 +3890,22 @@
     <w:abstractNumId w:val="3"/>
   </w:num>
   <w:num w:numId="2" w16cid:durableId="1388265895">
-    <w:abstractNumId w:val="16"/>
+    <w:abstractNumId w:val="21"/>
   </w:num>
   <w:num w:numId="3" w16cid:durableId="1957981314">
-    <w:abstractNumId w:val="6"/>
+    <w:abstractNumId w:val="9"/>
   </w:num>
   <w:num w:numId="4" w16cid:durableId="714043787">
     <w:abstractNumId w:val="1"/>
   </w:num>
   <w:num w:numId="5" w16cid:durableId="1113285754">
-    <w:abstractNumId w:val="12"/>
+    <w:abstractNumId w:val="17"/>
   </w:num>
   <w:num w:numId="6" w16cid:durableId="271325322">
-    <w:abstractNumId w:val="11"/>
+    <w:abstractNumId w:val="16"/>
   </w:num>
   <w:num w:numId="7" w16cid:durableId="651372768">
-    <w:abstractNumId w:val="8"/>
+    <w:abstractNumId w:val="12"/>
   </w:num>
   <w:num w:numId="8" w16cid:durableId="38360557">
     <w:abstractNumId w:val="4"/>
@@ -2995,43 +3914,58 @@
     <w:abstractNumId w:val="2"/>
   </w:num>
   <w:num w:numId="10" w16cid:durableId="1749308732">
+    <w:abstractNumId w:val="19"/>
+  </w:num>
+  <w:num w:numId="11" w16cid:durableId="879366035">
     <w:abstractNumId w:val="14"/>
   </w:num>
-  <w:num w:numId="11" w16cid:durableId="879366035">
-    <w:abstractNumId w:val="9"/>
-  </w:num>
   <w:num w:numId="12" w16cid:durableId="1564679821">
-    <w:abstractNumId w:val="13"/>
+    <w:abstractNumId w:val="18"/>
   </w:num>
   <w:num w:numId="13" w16cid:durableId="1568613147">
-    <w:abstractNumId w:val="10"/>
+    <w:abstractNumId w:val="15"/>
   </w:num>
   <w:num w:numId="14" w16cid:durableId="1276057524">
     <w:abstractNumId w:val="0"/>
   </w:num>
   <w:num w:numId="15" w16cid:durableId="812134524">
-    <w:abstractNumId w:val="18"/>
+    <w:abstractNumId w:val="23"/>
   </w:num>
   <w:num w:numId="16" w16cid:durableId="1604534336">
-    <w:abstractNumId w:val="19"/>
+    <w:abstractNumId w:val="24"/>
   </w:num>
   <w:num w:numId="17" w16cid:durableId="581722215">
+    <w:abstractNumId w:val="7"/>
+  </w:num>
+  <w:num w:numId="18" w16cid:durableId="742457894">
+    <w:abstractNumId w:val="11"/>
+  </w:num>
+  <w:num w:numId="19" w16cid:durableId="1850832079">
+    <w:abstractNumId w:val="22"/>
+  </w:num>
+  <w:num w:numId="20" w16cid:durableId="405148989">
+    <w:abstractNumId w:val="20"/>
+  </w:num>
+  <w:num w:numId="21" w16cid:durableId="562446030">
+    <w:abstractNumId w:val="13"/>
+  </w:num>
+  <w:num w:numId="22" w16cid:durableId="2105414231">
+    <w:abstractNumId w:val="8"/>
+  </w:num>
+  <w:num w:numId="23" w16cid:durableId="1457020241">
+    <w:abstractNumId w:val="6"/>
+  </w:num>
+  <w:num w:numId="24" w16cid:durableId="1968198421">
     <w:abstractNumId w:val="5"/>
   </w:num>
-  <w:num w:numId="18" w16cid:durableId="742457894">
-    <w:abstractNumId w:val="7"/>
-  </w:num>
-  <w:num w:numId="19" w16cid:durableId="1850832079">
-    <w:abstractNumId w:val="17"/>
-  </w:num>
-  <w:num w:numId="20" w16cid:durableId="405148989">
-    <w:abstractNumId w:val="15"/>
+  <w:num w:numId="25" w16cid:durableId="1106389985">
+    <w:abstractNumId w:val="10"/>
   </w:num>
 </w:numbering>
 </file>
 
 <file path=word/styles.xml><?xml version="1.0" encoding="utf-8"?>
-<w:styles xmlns:mc="http://schemas.openxmlformats.org/markup-compatibility/2006" xmlns:r="http://schemas.openxmlformats.org/officeDocument/2006/relationships" xmlns:w="http://schemas.openxmlformats.org/wordprocessingml/2006/main" xmlns:w14="http://schemas.microsoft.com/office/word/2010/wordml" xmlns:w15="http://schemas.microsoft.com/office/word/2012/wordml" xmlns:w16cex="http://schemas.microsoft.com/office/word/2018/wordml/cex" xmlns:w16cid="http://schemas.microsoft.com/office/word/2016/wordml/cid" xmlns:w16="http://schemas.microsoft.com/office/word/2018/wordml" xmlns:w16du="http://schemas.microsoft.com/office/word/2023/wordml/word16du" xmlns:w16sdtdh="http://schemas.microsoft.com/office/word/2020/wordml/sdtdatahash" xmlns:w16sdtfl="http://schemas.microsoft.com/office/word/2024/wordml/sdtformatlock" xmlns:w16se="http://schemas.microsoft.com/office/word/2015/wordml/symex" mc:Ignorable="w14 w15 w16se w16cid w16 w16cex w16sdtdh w16sdtfl w16du">
+<w:styles xmlns:mc="http://schemas.openxmlformats.org/markup-compatibility/2006" xmlns:r="http://schemas.openxmlformats.org/officeDocument/2006/relationships" xmlns:w="http://schemas.openxmlformats.org/wordprocessingml/2006/main" xmlns:w14="http://schemas.microsoft.com/office/word/2010/wordml" xmlns:w15="http://schemas.microsoft.com/office/word/2012/wordml" xmlns:w16cex="http://schemas.microsoft.com/office/word/2018/wordml/cex" xmlns:w16cid="http://schemas.microsoft.com/office/word/2016/wordml/cid" xmlns:w16="http://schemas.microsoft.com/office/word/2018/wordml" xmlns:w16du="http://schemas.microsoft.com/office/word/2023/wordml/word16du" xmlns:w16sdtdh="http://schemas.microsoft.com/office/word/2020/wordml/sdtdatahash" xmlns:w16se="http://schemas.microsoft.com/office/word/2015/wordml/symex" mc:Ignorable="w14 w15 w16se w16cid w16 w16cex w16sdtdh w16du">
   <w:docDefaults>
     <w:rPrDefault>
       <w:rPr>

</xml_diff>